<commit_message>
feat: added descriptions for all the scripts that can be displayed inside the GUi of the software. feat: added in a new script in data collection for btc price that includes all of the OHLCV data from yfiannce. fix: fixed an issue with logic execution order for the xLSTM-TS model training.
</commit_message>
<xml_diff>
--- a/User_Manual.docx
+++ b/User_Manual.docx
@@ -378,54 +378,11 @@
           <w:noProof/>
           <w:lang w:eastAsia="en-GB"/>
         </w:rPr>
-        <w:drawing>
-          <wp:inline distT="0" distB="0" distL="0" distR="0" wp14:anchorId="63E4B1F1" wp14:editId="578B5134">
-            <wp:extent cx="2962910" cy="3321050"/>
-            <wp:effectExtent l="0" t="0" r="8890" b="0"/>
-            <wp:docPr id="1" name="Picture 1" descr="C:\Users\Nina\AppData\Local\Microsoft\Windows\INetCache\Content.Word\Dataset_Collection_Methods.png"/>
-            <wp:cNvGraphicFramePr>
-              <a:graphicFrameLocks xmlns:a="http://schemas.openxmlformats.org/drawingml/2006/main" noChangeAspect="1"/>
-            </wp:cNvGraphicFramePr>
-            <a:graphic xmlns:a="http://schemas.openxmlformats.org/drawingml/2006/main">
-              <a:graphicData uri="http://schemas.openxmlformats.org/drawingml/2006/picture">
-                <pic:pic xmlns:pic="http://schemas.openxmlformats.org/drawingml/2006/picture">
-                  <pic:nvPicPr>
-                    <pic:cNvPr id="0" name="Picture 12" descr="C:\Users\Nina\AppData\Local\Microsoft\Windows\INetCache\Content.Word\Dataset_Collection_Methods.png"/>
-                    <pic:cNvPicPr>
-                      <a:picLocks noChangeAspect="1" noChangeArrowheads="1"/>
-                    </pic:cNvPicPr>
-                  </pic:nvPicPr>
-                  <pic:blipFill>
-                    <a:blip r:embed="rId7">
-                      <a:extLst>
-                        <a:ext uri="{28A0092B-C50C-407E-A947-70E740481C1C}">
-                          <a14:useLocalDpi xmlns:a14="http://schemas.microsoft.com/office/drawing/2010/main" val="0"/>
-                        </a:ext>
-                      </a:extLst>
-                    </a:blip>
-                    <a:srcRect/>
-                    <a:stretch>
-                      <a:fillRect/>
-                    </a:stretch>
-                  </pic:blipFill>
-                  <pic:spPr bwMode="auto">
-                    <a:xfrm>
-                      <a:off x="0" y="0"/>
-                      <a:ext cx="2962910" cy="3321050"/>
-                    </a:xfrm>
-                    <a:prstGeom prst="rect">
-                      <a:avLst/>
-                    </a:prstGeom>
-                    <a:noFill/>
-                    <a:ln>
-                      <a:noFill/>
-                    </a:ln>
-                  </pic:spPr>
-                </pic:pic>
-              </a:graphicData>
-            </a:graphic>
-          </wp:inline>
-        </w:drawing>
+        <w:pict>
+          <v:shape id="_x0000_i1027" type="#_x0000_t75" style="width:300.1pt;height:285.1pt">
+            <v:imagedata r:id="rId7" o:title="Dataset_Collection_Methods"/>
+          </v:shape>
+        </w:pict>
       </w:r>
     </w:p>
     <w:p>
@@ -529,7 +486,13 @@
         <w:t>B</w:t>
       </w:r>
       <w:r>
-        <w:t>itcoin from the specified date range</w:t>
+        <w:t>itcoin</w:t>
+      </w:r>
+      <w:r>
+        <w:t xml:space="preserve"> (BTC)</w:t>
+      </w:r>
+      <w:r>
+        <w:t xml:space="preserve"> from the specified date range</w:t>
       </w:r>
       <w:r>
         <w:t>, and produce a two column “.</w:t>
@@ -542,17 +505,18 @@
       <w:r>
         <w:t xml:space="preserve">” file with the date/time as the first and the </w:t>
       </w:r>
-      <w:proofErr w:type="spellStart"/>
-      <w:r>
-        <w:t>btc</w:t>
-      </w:r>
-      <w:proofErr w:type="spellEnd"/>
+      <w:r>
+        <w:t>BTC</w:t>
+      </w:r>
       <w:r>
         <w:t xml:space="preserve"> ticket prices as the second</w:t>
       </w:r>
       <w:r>
         <w:t>.</w:t>
       </w:r>
+      <w:r>
+        <w:t xml:space="preserve"> Each script also includes a brief tooltip description of their function and purpose that is populated from inside the script’s code.</w:t>
+      </w:r>
     </w:p>
     <w:p>
       <w:r>
@@ -598,6 +562,7 @@
     </w:p>
     <w:p>
       <w:r>
+        <w:lastRenderedPageBreak/>
         <w:t>The date range and frequency that the “</w:t>
       </w:r>
       <w:proofErr w:type="spellStart"/>
@@ -606,11 +571,7 @@
       </w:r>
       <w:proofErr w:type="spellEnd"/>
       <w:r>
-        <w:t xml:space="preserve">” API accepts varies depending on the market ticket, as such there may be some market tickets that will through errors if the frequency and date range </w:t>
-      </w:r>
-      <w:r>
-        <w:lastRenderedPageBreak/>
-        <w:t>does not match the API’s expected input for said ticket. The console output window should attempt to indicate this however it is a limitation with the API itself.</w:t>
+        <w:t>” API accepts varies depending on the market ticket, as such there may be some market tickets that will through errors if the frequency and date range does not match the API’s expected input for said ticket. The console output window should attempt to indicate this however it is a limitation with the API itself.</w:t>
       </w:r>
     </w:p>
     <w:p>
@@ -699,7 +660,7 @@
       </w:pPr>
       <w:r>
         <w:pict>
-          <v:shape id="_x0000_i1027" type="#_x0000_t75" style="width:280.5pt;height:307.6pt">
+          <v:shape id="_x0000_i1028" type="#_x0000_t75" style="width:248.85pt;height:273.6pt">
             <v:imagedata r:id="rId8" o:title="Analyse_Data_Collection"/>
           </v:shape>
         </w:pict>
@@ -825,7 +786,7 @@
       </w:pPr>
       <w:r>
         <w:pict>
-          <v:shape id="_x0000_i1028" type="#_x0000_t75" style="width:451pt;height:444.1pt">
+          <v:shape id="_x0000_i1029" type="#_x0000_t75" style="width:451pt;height:444.1pt">
             <v:imagedata r:id="rId9" o:title="Example_Plolt_Analyse"/>
           </v:shape>
         </w:pict>
@@ -1010,7 +971,7 @@
       </w:pPr>
       <w:r>
         <w:pict>
-          <v:shape id="_x0000_i1029" type="#_x0000_t75" style="width:266.1pt;height:303.55pt">
+          <v:shape id="_x0000_i1030" type="#_x0000_t75" style="width:250pt;height:284.55pt">
             <v:imagedata r:id="rId10" o:title="feature_selection_window"/>
           </v:shape>
         </w:pict>
@@ -1091,7 +1052,7 @@
       </w:pPr>
       <w:r>
         <w:pict>
-          <v:shape id="_x0000_i1030" type="#_x0000_t75" style="width:397.45pt;height:222.35pt">
+          <v:shape id="_x0000_i1031" type="#_x0000_t75" style="width:397.45pt;height:222.35pt">
             <v:imagedata r:id="rId11" o:title="feature_selection_plot_example"/>
           </v:shape>
         </w:pict>
@@ -1247,7 +1208,7 @@
       </w:r>
       <w:r>
         <w:pict>
-          <v:shape id="_x0000_i1031" type="#_x0000_t75" style="width:368.65pt;height:104.85pt">
+          <v:shape id="_x0000_i1032" type="#_x0000_t75" style="width:368.65pt;height:104.85pt">
             <v:imagedata r:id="rId12" o:title="xLSTM_TS_chart_modules_with_legend"/>
           </v:shape>
         </w:pict>
@@ -1347,7 +1308,7 @@
       </w:pPr>
       <w:r>
         <w:pict>
-          <v:shape id="_x0000_i1032" type="#_x0000_t75" style="width:304.7pt;height:334.1pt">
+          <v:shape id="_x0000_i1033" type="#_x0000_t75" style="width:304.7pt;height:334.1pt">
             <v:imagedata r:id="rId13" o:title="AI_Model_Map_Code_Example"/>
           </v:shape>
         </w:pict>
@@ -1475,7 +1436,7 @@
       </w:pPr>
       <w:r>
         <w:pict>
-          <v:shape id="_x0000_i1033" type="#_x0000_t75" style="width:236.15pt;height:289.75pt">
+          <v:shape id="_x0000_i1034" type="#_x0000_t75" style="width:236.15pt;height:289.75pt">
             <v:imagedata r:id="rId14" o:title="AI_Model_Training_MEMD"/>
           </v:shape>
         </w:pict>
@@ -1546,7 +1507,7 @@
       </w:pPr>
       <w:r>
         <w:pict>
-          <v:shape id="_x0000_i1034" type="#_x0000_t75" style="width:236.15pt;height:266.7pt">
+          <v:shape id="_x0000_i1035" type="#_x0000_t75" style="width:236.15pt;height:266.7pt">
             <v:imagedata r:id="rId15" o:title="AI_Model_Training_xLSTM"/>
           </v:shape>
         </w:pict>
@@ -1755,7 +1716,7 @@
       </w:pPr>
       <w:r>
         <w:pict>
-          <v:shape id="_x0000_i1035" type="#_x0000_t75" style="width:272.45pt;height:212.55pt">
+          <v:shape id="_x0000_i1036" type="#_x0000_t75" style="width:303.55pt;height:237.3pt">
             <v:imagedata r:id="rId16" o:title="AI_Model_Evaluation_Window"/>
           </v:shape>
         </w:pict>
@@ -1825,7 +1786,6 @@
         <w:t xml:space="preserve"> </w:t>
       </w:r>
     </w:p>
-    <w:p/>
     <w:p>
       <w:r>
         <w:lastRenderedPageBreak/>
@@ -1933,7 +1893,7 @@
       </w:pPr>
       <w:r>
         <w:pict>
-          <v:shape id="_x0000_i1036" type="#_x0000_t75" style="width:425.1pt;height:245.4pt">
+          <v:shape id="_x0000_i1037" type="#_x0000_t75" style="width:425.1pt;height:245.4pt">
             <v:imagedata r:id="rId17" o:title="predictions_vs_actuals_Example"/>
           </v:shape>
         </w:pict>
@@ -2092,7 +2052,7 @@
       </w:pPr>
       <w:r>
         <w:pict>
-          <v:shape id="_x0000_i1037" type="#_x0000_t75" style="width:391.7pt;height:260.35pt">
+          <v:shape id="_x0000_i1038" type="#_x0000_t75" style="width:391.7pt;height:260.35pt">
             <v:imagedata r:id="rId18" o:title="scripting_example_data_collection_1"/>
           </v:shape>
         </w:pict>
@@ -2172,8 +2132,6 @@
       <w:r>
         <w:t xml:space="preserve">” (data frame) formatting, and returns </w:t>
       </w:r>
-      <w:bookmarkStart w:id="0" w:name="_GoBack"/>
-      <w:bookmarkEnd w:id="0"/>
     </w:p>
     <w:p/>
     <w:p/>
@@ -2186,7 +2144,7 @@
       <w:r>
         <w:lastRenderedPageBreak/>
         <w:pict>
-          <v:shape id="_x0000_i1038" type="#_x0000_t75" style="width:408.4pt;height:305.3pt">
+          <v:shape id="_x0000_i1039" type="#_x0000_t75" style="width:408.4pt;height:305.3pt">
             <v:imagedata r:id="rId19" o:title="scripting_example_data_collection"/>
           </v:shape>
         </w:pict>
@@ -2262,8 +2220,44 @@
     </w:p>
     <w:p>
       <w:r>
+        <w:t xml:space="preserve">Just handle panda’s / data frames </w:t>
+      </w:r>
+      <w:proofErr w:type="gramStart"/>
+      <w:r>
+        <w:t>good</w:t>
+      </w:r>
+      <w:proofErr w:type="gramEnd"/>
+      <w:r>
+        <w:t xml:space="preserve">, with </w:t>
+      </w:r>
+      <w:proofErr w:type="spellStart"/>
+      <w:r>
+        <w:t>seaborn</w:t>
+      </w:r>
+      <w:proofErr w:type="spellEnd"/>
+      <w:r>
+        <w:t xml:space="preserve"> when using graphs.</w:t>
+      </w:r>
+    </w:p>
+    <w:p>
+      <w:r>
         <w:t>Adding Scripts for additional AI Model Designs</w:t>
       </w:r>
+    </w:p>
+    <w:p>
+      <w:r>
+        <w:t xml:space="preserve">Make sure to use </w:t>
+      </w:r>
+      <w:proofErr w:type="spellStart"/>
+      <w:r>
+        <w:t>arg.parse</w:t>
+      </w:r>
+      <w:proofErr w:type="spellEnd"/>
+      <w:r>
+        <w:t>, include a train.py for it.</w:t>
+      </w:r>
+      <w:bookmarkStart w:id="0" w:name="_GoBack"/>
+      <w:bookmarkEnd w:id="0"/>
     </w:p>
     <w:p>
       <w:r>

</xml_diff>

<commit_message>
fix: updated three of the plot graphs to include console output for usability, and updated/completed the user manual.
</commit_message>
<xml_diff>
--- a/User_Manual.docx
+++ b/User_Manual.docx
@@ -2,6 +2,611 @@
 <file path=word/document.xml><?xml version="1.0" encoding="utf-8"?>
 <w:document xmlns:wpc="http://schemas.microsoft.com/office/word/2010/wordprocessingCanvas" xmlns:mc="http://schemas.openxmlformats.org/markup-compatibility/2006" xmlns:o="urn:schemas-microsoft-com:office:office" xmlns:r="http://schemas.openxmlformats.org/officeDocument/2006/relationships" xmlns:m="http://schemas.openxmlformats.org/officeDocument/2006/math" xmlns:v="urn:schemas-microsoft-com:vml" xmlns:wp14="http://schemas.microsoft.com/office/word/2010/wordprocessingDrawing" xmlns:wp="http://schemas.openxmlformats.org/drawingml/2006/wordprocessingDrawing" xmlns:w10="urn:schemas-microsoft-com:office:word" xmlns:w="http://schemas.openxmlformats.org/wordprocessingml/2006/main" xmlns:w14="http://schemas.microsoft.com/office/word/2010/wordml" xmlns:wpg="http://schemas.microsoft.com/office/word/2010/wordprocessingGroup" xmlns:wpi="http://schemas.microsoft.com/office/word/2010/wordprocessingInk" xmlns:wne="http://schemas.microsoft.com/office/word/2006/wordml" xmlns:wps="http://schemas.microsoft.com/office/word/2010/wordprocessingShape" mc:Ignorable="w14 wp14">
   <w:body>
+    <w:sdt>
+      <w:sdtPr>
+        <w:id w:val="448136556"/>
+        <w:docPartObj>
+          <w:docPartGallery w:val="Table of Contents"/>
+          <w:docPartUnique/>
+        </w:docPartObj>
+      </w:sdtPr>
+      <w:sdtEndPr>
+        <w:rPr>
+          <w:rFonts w:asciiTheme="minorHAnsi" w:eastAsiaTheme="minorHAnsi" w:hAnsiTheme="minorHAnsi" w:cstheme="minorBidi"/>
+          <w:noProof/>
+          <w:color w:val="auto"/>
+          <w:sz w:val="22"/>
+          <w:szCs w:val="22"/>
+          <w:lang w:val="en-GB" w:eastAsia="en-US"/>
+        </w:rPr>
+      </w:sdtEndPr>
+      <w:sdtContent>
+        <w:p>
+          <w:pPr>
+            <w:pStyle w:val="TOCHeading"/>
+            <w:rPr>
+              <w:color w:val="auto"/>
+            </w:rPr>
+          </w:pPr>
+          <w:r>
+            <w:rPr>
+              <w:color w:val="auto"/>
+            </w:rPr>
+            <w:t>Contents</w:t>
+          </w:r>
+        </w:p>
+        <w:p>
+          <w:pPr>
+            <w:pStyle w:val="TOC1"/>
+            <w:tabs>
+              <w:tab w:val="right" w:leader="dot" w:pos="9016"/>
+            </w:tabs>
+            <w:rPr>
+              <w:noProof/>
+            </w:rPr>
+          </w:pPr>
+          <w:r>
+            <w:fldChar w:fldCharType="begin"/>
+          </w:r>
+          <w:r>
+            <w:instrText xml:space="preserve"> TOC \o "1-3" \h \z \u </w:instrText>
+          </w:r>
+          <w:r>
+            <w:fldChar w:fldCharType="separate"/>
+          </w:r>
+          <w:hyperlink w:anchor="_Toc226553702" w:history="1">
+            <w:r>
+              <w:rPr>
+                <w:rStyle w:val="Hyperlink"/>
+                <w:noProof/>
+              </w:rPr>
+              <w:t>Requirements and Environment setup:</w:t>
+            </w:r>
+            <w:r>
+              <w:rPr>
+                <w:noProof/>
+                <w:webHidden/>
+              </w:rPr>
+              <w:tab/>
+            </w:r>
+            <w:r>
+              <w:rPr>
+                <w:noProof/>
+                <w:webHidden/>
+              </w:rPr>
+              <w:fldChar w:fldCharType="begin"/>
+            </w:r>
+            <w:r>
+              <w:rPr>
+                <w:noProof/>
+                <w:webHidden/>
+              </w:rPr>
+              <w:instrText xml:space="preserve"> PAGEREF _Toc226553702 \h </w:instrText>
+            </w:r>
+            <w:r>
+              <w:rPr>
+                <w:noProof/>
+                <w:webHidden/>
+              </w:rPr>
+            </w:r>
+            <w:r>
+              <w:rPr>
+                <w:noProof/>
+                <w:webHidden/>
+              </w:rPr>
+              <w:fldChar w:fldCharType="separate"/>
+            </w:r>
+            <w:r>
+              <w:rPr>
+                <w:noProof/>
+                <w:webHidden/>
+              </w:rPr>
+              <w:t>1</w:t>
+            </w:r>
+            <w:r>
+              <w:rPr>
+                <w:noProof/>
+                <w:webHidden/>
+              </w:rPr>
+              <w:fldChar w:fldCharType="end"/>
+            </w:r>
+          </w:hyperlink>
+        </w:p>
+        <w:p>
+          <w:pPr>
+            <w:pStyle w:val="TOC1"/>
+            <w:tabs>
+              <w:tab w:val="right" w:leader="dot" w:pos="9016"/>
+            </w:tabs>
+            <w:rPr>
+              <w:noProof/>
+            </w:rPr>
+          </w:pPr>
+          <w:hyperlink w:anchor="_Toc226553703" w:history="1">
+            <w:r>
+              <w:rPr>
+                <w:rStyle w:val="Hyperlink"/>
+                <w:noProof/>
+              </w:rPr>
+              <w:t>How to use and navigate the Model Designer:</w:t>
+            </w:r>
+            <w:r>
+              <w:rPr>
+                <w:noProof/>
+                <w:webHidden/>
+              </w:rPr>
+              <w:tab/>
+            </w:r>
+            <w:r>
+              <w:rPr>
+                <w:noProof/>
+                <w:webHidden/>
+              </w:rPr>
+              <w:fldChar w:fldCharType="begin"/>
+            </w:r>
+            <w:r>
+              <w:rPr>
+                <w:noProof/>
+                <w:webHidden/>
+              </w:rPr>
+              <w:instrText xml:space="preserve"> PAGEREF _Toc226553703 \h </w:instrText>
+            </w:r>
+            <w:r>
+              <w:rPr>
+                <w:noProof/>
+                <w:webHidden/>
+              </w:rPr>
+            </w:r>
+            <w:r>
+              <w:rPr>
+                <w:noProof/>
+                <w:webHidden/>
+              </w:rPr>
+              <w:fldChar w:fldCharType="separate"/>
+            </w:r>
+            <w:r>
+              <w:rPr>
+                <w:noProof/>
+                <w:webHidden/>
+              </w:rPr>
+              <w:t>2</w:t>
+            </w:r>
+            <w:r>
+              <w:rPr>
+                <w:noProof/>
+                <w:webHidden/>
+              </w:rPr>
+              <w:fldChar w:fldCharType="end"/>
+            </w:r>
+          </w:hyperlink>
+        </w:p>
+        <w:p>
+          <w:pPr>
+            <w:pStyle w:val="TOC2"/>
+            <w:tabs>
+              <w:tab w:val="right" w:leader="dot" w:pos="9016"/>
+            </w:tabs>
+            <w:rPr>
+              <w:noProof/>
+            </w:rPr>
+          </w:pPr>
+          <w:hyperlink w:anchor="_Toc226553704" w:history="1">
+            <w:r>
+              <w:rPr>
+                <w:rStyle w:val="Hyperlink"/>
+                <w:noProof/>
+              </w:rPr>
+              <w:t>Dataset Collection Method:</w:t>
+            </w:r>
+            <w:r>
+              <w:rPr>
+                <w:noProof/>
+                <w:webHidden/>
+              </w:rPr>
+              <w:tab/>
+            </w:r>
+            <w:r>
+              <w:rPr>
+                <w:noProof/>
+                <w:webHidden/>
+              </w:rPr>
+              <w:fldChar w:fldCharType="begin"/>
+            </w:r>
+            <w:r>
+              <w:rPr>
+                <w:noProof/>
+                <w:webHidden/>
+              </w:rPr>
+              <w:instrText xml:space="preserve"> PAGEREF _Toc226553704 \h </w:instrText>
+            </w:r>
+            <w:r>
+              <w:rPr>
+                <w:noProof/>
+                <w:webHidden/>
+              </w:rPr>
+            </w:r>
+            <w:r>
+              <w:rPr>
+                <w:noProof/>
+                <w:webHidden/>
+              </w:rPr>
+              <w:fldChar w:fldCharType="separate"/>
+            </w:r>
+            <w:r>
+              <w:rPr>
+                <w:noProof/>
+                <w:webHidden/>
+              </w:rPr>
+              <w:t>3</w:t>
+            </w:r>
+            <w:r>
+              <w:rPr>
+                <w:noProof/>
+                <w:webHidden/>
+              </w:rPr>
+              <w:fldChar w:fldCharType="end"/>
+            </w:r>
+          </w:hyperlink>
+        </w:p>
+        <w:p>
+          <w:pPr>
+            <w:pStyle w:val="TOC2"/>
+            <w:tabs>
+              <w:tab w:val="right" w:leader="dot" w:pos="9016"/>
+            </w:tabs>
+            <w:rPr>
+              <w:noProof/>
+            </w:rPr>
+          </w:pPr>
+          <w:hyperlink w:anchor="_Toc226553705" w:history="1">
+            <w:r>
+              <w:rPr>
+                <w:rStyle w:val="Hyperlink"/>
+                <w:noProof/>
+              </w:rPr>
+              <w:t>Dataset Processing Method:</w:t>
+            </w:r>
+            <w:r>
+              <w:rPr>
+                <w:noProof/>
+                <w:webHidden/>
+              </w:rPr>
+              <w:tab/>
+            </w:r>
+            <w:r>
+              <w:rPr>
+                <w:noProof/>
+                <w:webHidden/>
+              </w:rPr>
+              <w:fldChar w:fldCharType="begin"/>
+            </w:r>
+            <w:r>
+              <w:rPr>
+                <w:noProof/>
+                <w:webHidden/>
+              </w:rPr>
+              <w:instrText xml:space="preserve"> PAGEREF _Toc226553705 \h </w:instrText>
+            </w:r>
+            <w:r>
+              <w:rPr>
+                <w:noProof/>
+                <w:webHidden/>
+              </w:rPr>
+            </w:r>
+            <w:r>
+              <w:rPr>
+                <w:noProof/>
+                <w:webHidden/>
+              </w:rPr>
+              <w:fldChar w:fldCharType="separate"/>
+            </w:r>
+            <w:r>
+              <w:rPr>
+                <w:noProof/>
+                <w:webHidden/>
+              </w:rPr>
+              <w:t>5</w:t>
+            </w:r>
+            <w:r>
+              <w:rPr>
+                <w:noProof/>
+                <w:webHidden/>
+              </w:rPr>
+              <w:fldChar w:fldCharType="end"/>
+            </w:r>
+          </w:hyperlink>
+        </w:p>
+        <w:p>
+          <w:pPr>
+            <w:pStyle w:val="TOC2"/>
+            <w:tabs>
+              <w:tab w:val="right" w:leader="dot" w:pos="9016"/>
+            </w:tabs>
+            <w:rPr>
+              <w:noProof/>
+            </w:rPr>
+          </w:pPr>
+          <w:hyperlink w:anchor="_Toc226553706" w:history="1">
+            <w:r>
+              <w:rPr>
+                <w:rStyle w:val="Hyperlink"/>
+                <w:noProof/>
+              </w:rPr>
+              <w:t>AI Model Designs:</w:t>
+            </w:r>
+            <w:r>
+              <w:rPr>
+                <w:noProof/>
+                <w:webHidden/>
+              </w:rPr>
+              <w:tab/>
+            </w:r>
+            <w:r>
+              <w:rPr>
+                <w:noProof/>
+                <w:webHidden/>
+              </w:rPr>
+              <w:fldChar w:fldCharType="begin"/>
+            </w:r>
+            <w:r>
+              <w:rPr>
+                <w:noProof/>
+                <w:webHidden/>
+              </w:rPr>
+              <w:instrText xml:space="preserve"> PAGEREF _Toc226553706 \h </w:instrText>
+            </w:r>
+            <w:r>
+              <w:rPr>
+                <w:noProof/>
+                <w:webHidden/>
+              </w:rPr>
+            </w:r>
+            <w:r>
+              <w:rPr>
+                <w:noProof/>
+                <w:webHidden/>
+              </w:rPr>
+              <w:fldChar w:fldCharType="separate"/>
+            </w:r>
+            <w:r>
+              <w:rPr>
+                <w:noProof/>
+                <w:webHidden/>
+              </w:rPr>
+              <w:t>8</w:t>
+            </w:r>
+            <w:r>
+              <w:rPr>
+                <w:noProof/>
+                <w:webHidden/>
+              </w:rPr>
+              <w:fldChar w:fldCharType="end"/>
+            </w:r>
+          </w:hyperlink>
+        </w:p>
+        <w:p>
+          <w:pPr>
+            <w:pStyle w:val="TOC2"/>
+            <w:tabs>
+              <w:tab w:val="right" w:leader="dot" w:pos="9016"/>
+            </w:tabs>
+            <w:rPr>
+              <w:noProof/>
+            </w:rPr>
+          </w:pPr>
+          <w:hyperlink w:anchor="_Toc226553707" w:history="1">
+            <w:r>
+              <w:rPr>
+                <w:rStyle w:val="Hyperlink"/>
+                <w:noProof/>
+              </w:rPr>
+              <w:t>AI Training Method:</w:t>
+            </w:r>
+            <w:r>
+              <w:rPr>
+                <w:noProof/>
+                <w:webHidden/>
+              </w:rPr>
+              <w:tab/>
+            </w:r>
+            <w:r>
+              <w:rPr>
+                <w:noProof/>
+                <w:webHidden/>
+              </w:rPr>
+              <w:fldChar w:fldCharType="begin"/>
+            </w:r>
+            <w:r>
+              <w:rPr>
+                <w:noProof/>
+                <w:webHidden/>
+              </w:rPr>
+              <w:instrText xml:space="preserve"> PAGEREF _Toc226553707 \h </w:instrText>
+            </w:r>
+            <w:r>
+              <w:rPr>
+                <w:noProof/>
+                <w:webHidden/>
+              </w:rPr>
+            </w:r>
+            <w:r>
+              <w:rPr>
+                <w:noProof/>
+                <w:webHidden/>
+              </w:rPr>
+              <w:fldChar w:fldCharType="separate"/>
+            </w:r>
+            <w:r>
+              <w:rPr>
+                <w:noProof/>
+                <w:webHidden/>
+              </w:rPr>
+              <w:t>9</w:t>
+            </w:r>
+            <w:r>
+              <w:rPr>
+                <w:noProof/>
+                <w:webHidden/>
+              </w:rPr>
+              <w:fldChar w:fldCharType="end"/>
+            </w:r>
+          </w:hyperlink>
+        </w:p>
+        <w:p>
+          <w:pPr>
+            <w:pStyle w:val="TOC2"/>
+            <w:tabs>
+              <w:tab w:val="right" w:leader="dot" w:pos="9016"/>
+            </w:tabs>
+            <w:rPr>
+              <w:noProof/>
+            </w:rPr>
+          </w:pPr>
+          <w:hyperlink w:anchor="_Toc226553708" w:history="1">
+            <w:r>
+              <w:rPr>
+                <w:rStyle w:val="Hyperlink"/>
+                <w:noProof/>
+              </w:rPr>
+              <w:t>Model Evaluation Method:</w:t>
+            </w:r>
+            <w:r>
+              <w:rPr>
+                <w:noProof/>
+                <w:webHidden/>
+              </w:rPr>
+              <w:tab/>
+            </w:r>
+            <w:r>
+              <w:rPr>
+                <w:noProof/>
+                <w:webHidden/>
+              </w:rPr>
+              <w:fldChar w:fldCharType="begin"/>
+            </w:r>
+            <w:r>
+              <w:rPr>
+                <w:noProof/>
+                <w:webHidden/>
+              </w:rPr>
+              <w:instrText xml:space="preserve"> PAGEREF _Toc226553708 \h </w:instrText>
+            </w:r>
+            <w:r>
+              <w:rPr>
+                <w:noProof/>
+                <w:webHidden/>
+              </w:rPr>
+            </w:r>
+            <w:r>
+              <w:rPr>
+                <w:noProof/>
+                <w:webHidden/>
+              </w:rPr>
+              <w:fldChar w:fldCharType="separate"/>
+            </w:r>
+            <w:r>
+              <w:rPr>
+                <w:noProof/>
+                <w:webHidden/>
+              </w:rPr>
+              <w:t>11</w:t>
+            </w:r>
+            <w:r>
+              <w:rPr>
+                <w:noProof/>
+                <w:webHidden/>
+              </w:rPr>
+              <w:fldChar w:fldCharType="end"/>
+            </w:r>
+          </w:hyperlink>
+        </w:p>
+        <w:p>
+          <w:pPr>
+            <w:pStyle w:val="TOC1"/>
+            <w:tabs>
+              <w:tab w:val="right" w:leader="dot" w:pos="9016"/>
+            </w:tabs>
+            <w:rPr>
+              <w:noProof/>
+            </w:rPr>
+          </w:pPr>
+          <w:hyperlink w:anchor="_Toc226553709" w:history="1">
+            <w:r>
+              <w:rPr>
+                <w:rStyle w:val="Hyperlink"/>
+                <w:noProof/>
+              </w:rPr>
+              <w:t>Adding new custom Scripts</w:t>
+            </w:r>
+            <w:r>
+              <w:rPr>
+                <w:noProof/>
+                <w:webHidden/>
+              </w:rPr>
+              <w:tab/>
+            </w:r>
+            <w:r>
+              <w:rPr>
+                <w:noProof/>
+                <w:webHidden/>
+              </w:rPr>
+              <w:fldChar w:fldCharType="begin"/>
+            </w:r>
+            <w:r>
+              <w:rPr>
+                <w:noProof/>
+                <w:webHidden/>
+              </w:rPr>
+              <w:instrText xml:space="preserve"> PAGEREF _Toc226553709 \h </w:instrText>
+            </w:r>
+            <w:r>
+              <w:rPr>
+                <w:noProof/>
+                <w:webHidden/>
+              </w:rPr>
+            </w:r>
+            <w:r>
+              <w:rPr>
+                <w:noProof/>
+                <w:webHidden/>
+              </w:rPr>
+              <w:fldChar w:fldCharType="separate"/>
+            </w:r>
+            <w:r>
+              <w:rPr>
+                <w:noProof/>
+                <w:webHidden/>
+              </w:rPr>
+              <w:t>13</w:t>
+            </w:r>
+            <w:r>
+              <w:rPr>
+                <w:noProof/>
+                <w:webHidden/>
+              </w:rPr>
+              <w:fldChar w:fldCharType="end"/>
+            </w:r>
+          </w:hyperlink>
+        </w:p>
+        <w:p>
+          <w:pPr>
+            <w:rPr>
+              <w:b/>
+              <w:bCs/>
+              <w:noProof/>
+            </w:rPr>
+          </w:pPr>
+          <w:r>
+            <w:rPr>
+              <w:b/>
+              <w:bCs/>
+              <w:noProof/>
+            </w:rPr>
+            <w:fldChar w:fldCharType="end"/>
+          </w:r>
+        </w:p>
+      </w:sdtContent>
+    </w:sdt>
     <w:p>
       <w:pPr>
         <w:pStyle w:val="Heading1"/>
@@ -22,7 +627,10 @@
         <w:t>:</w:t>
       </w:r>
     </w:p>
-    <w:p/>
+    <w:p>
+      <w:bookmarkStart w:id="0" w:name="_GoBack"/>
+      <w:bookmarkEnd w:id="0"/>
+    </w:p>
     <w:p>
       <w:r>
         <w:t xml:space="preserve">When running the application for the first time, first the user must have download and installed a python “IDE” (integrated development environment) such as visual studio code, with a compatible version of python and preferably Git for ease of pulling the </w:t>
@@ -120,6 +728,7 @@
         <w:keepNext/>
       </w:pPr>
       <w:r>
+        <w:lastRenderedPageBreak/>
         <w:pict>
           <v:shapetype id="_x0000_t75" coordsize="21600,21600" o:spt="75" o:preferrelative="t" path="m@4@5l@4@11@9@11@9@5xe" filled="f" stroked="f">
             <v:stroke joinstyle="miter"/>
@@ -141,7 +750,7 @@
             <o:lock v:ext="edit" aspectratio="t"/>
           </v:shapetype>
           <v:shape id="_x0000_i1025" type="#_x0000_t75" style="width:485pt;height:130.2pt">
-            <v:imagedata r:id="rId5" o:title="dependencies_txt"/>
+            <v:imagedata r:id="rId6" o:title="dependencies_txt"/>
           </v:shape>
         </w:pict>
       </w:r>
@@ -233,7 +842,6 @@
         <w:rPr>
           <w:color w:val="auto"/>
         </w:rPr>
-        <w:lastRenderedPageBreak/>
         <w:t>How to use and navigate the Model Designer</w:t>
       </w:r>
       <w:r>
@@ -270,9 +878,10 @@
         <w:keepNext/>
       </w:pPr>
       <w:r>
+        <w:lastRenderedPageBreak/>
         <w:pict>
           <v:shape id="_x0000_i1026" type="#_x0000_t75" style="width:451pt;height:327.15pt">
-            <v:imagedata r:id="rId6" o:title="Model_Designerr_Main_Screen"/>
+            <v:imagedata r:id="rId7" o:title="Model_Designerr_Main_Screen"/>
           </v:shape>
         </w:pict>
       </w:r>
@@ -352,7 +961,6 @@
           <w:b w:val="0"/>
           <w:color w:val="auto"/>
         </w:rPr>
-        <w:lastRenderedPageBreak/>
         <w:t>Dataset Collection Method</w:t>
       </w:r>
       <w:r>
@@ -378,9 +986,10 @@
           <w:noProof/>
           <w:lang w:eastAsia="en-GB"/>
         </w:rPr>
+        <w:lastRenderedPageBreak/>
         <w:pict>
           <v:shape id="_x0000_i1027" type="#_x0000_t75" style="width:300.1pt;height:285.1pt">
-            <v:imagedata r:id="rId7" o:title="Dataset_Collection_Methods"/>
+            <v:imagedata r:id="rId8" o:title="Dataset_Collection_Methods"/>
           </v:shape>
         </w:pict>
       </w:r>
@@ -562,21 +1171,24 @@
     </w:p>
     <w:p>
       <w:r>
+        <w:t>The date range and frequency that the “</w:t>
+      </w:r>
+      <w:proofErr w:type="spellStart"/>
+      <w:r>
+        <w:t>yfinance</w:t>
+      </w:r>
+      <w:proofErr w:type="spellEnd"/>
+      <w:r>
+        <w:t>” API accepts varies depending on the market ticket, as such there may be some market tickets that will through errors if the frequency and date range does not match the API’s expected input for said ticket. The console output window should attempt to indicate this however it is a limitation with the API itself.</w:t>
+      </w:r>
+    </w:p>
+    <w:p>
+      <w:r>
+        <w:t xml:space="preserve">Once all the features that the user wishes to include in the dataset is selected with the desired date range and frequency, clicking the “OK” button and return to the previous window and click the </w:t>
+      </w:r>
+      <w:r>
         <w:lastRenderedPageBreak/>
-        <w:t>The date range and frequency that the “</w:t>
-      </w:r>
-      <w:proofErr w:type="spellStart"/>
-      <w:r>
-        <w:t>yfinance</w:t>
-      </w:r>
-      <w:proofErr w:type="spellEnd"/>
-      <w:r>
-        <w:t>” API accepts varies depending on the market ticket, as such there may be some market tickets that will through errors if the frequency and date range does not match the API’s expected input for said ticket. The console output window should attempt to indicate this however it is a limitation with the API itself.</w:t>
-      </w:r>
-    </w:p>
-    <w:p>
-      <w:r>
-        <w:t>Once all the features that the user wishes to include in the dataset is selected with the desired date range and frequency, clicking the “OK” button and return to the previous window and click the “Run” button for the Dataset Collection Method. This will execute all the selected scripts and combine each scripts single column feature, into a single “.</w:t>
+        <w:t>“Run” button for the Dataset Collection Method. This will execute all the selected scripts and combine each scripts single column feature, into a single “.</w:t>
       </w:r>
       <w:proofErr w:type="spellStart"/>
       <w:r>
@@ -661,7 +1273,7 @@
       <w:r>
         <w:pict>
           <v:shape id="_x0000_i1028" type="#_x0000_t75" style="width:248.85pt;height:273.6pt">
-            <v:imagedata r:id="rId8" o:title="Analyse_Data_Collection"/>
+            <v:imagedata r:id="rId9" o:title="Analyse_Data_Collection"/>
           </v:shape>
         </w:pict>
       </w:r>
@@ -727,36 +1339,39 @@
     </w:p>
     <w:p>
       <w:r>
+        <w:t xml:space="preserve">The “Dataset CSV (passed to scripts via --dataset)” section is a drop down menu where the user can select a dataset (a list populated from </w:t>
+      </w:r>
+      <w:r>
+        <w:t xml:space="preserve">the dataset output directory: </w:t>
+      </w:r>
+      <w:r>
+        <w:t>\</w:t>
+      </w:r>
+      <w:proofErr w:type="spellStart"/>
+      <w:r>
+        <w:t>Dataset_Modules</w:t>
+      </w:r>
+      <w:proofErr w:type="spellEnd"/>
+      <w:r>
+        <w:t>\</w:t>
+      </w:r>
+      <w:proofErr w:type="spellStart"/>
+      <w:r>
+        <w:t>dataset_output</w:t>
+      </w:r>
+      <w:proofErr w:type="spellEnd"/>
+      <w:r>
+        <w:t>) of which to perform the analysis on, using the scripts listed in the below section with checkboxes. The included analysis scripts all perform functionality described by their name, both prefix “Check_” scripts for missing data and outliers will only run in the console output window below</w:t>
+      </w:r>
+      <w:r>
+        <w:t xml:space="preserve"> (Use the “Run button as before to execute all selected scripts)</w:t>
+      </w:r>
+      <w:r>
+        <w:t xml:space="preserve">, while all of the </w:t>
+      </w:r>
+      <w:r>
         <w:lastRenderedPageBreak/>
-        <w:t xml:space="preserve">The “Dataset CSV (passed to scripts via --dataset)” section is a drop down menu where the user can select a dataset (a list populated from </w:t>
-      </w:r>
-      <w:r>
-        <w:t xml:space="preserve">the dataset output directory: </w:t>
-      </w:r>
-      <w:r>
-        <w:t>\</w:t>
-      </w:r>
-      <w:proofErr w:type="spellStart"/>
-      <w:r>
-        <w:t>Dataset_Modules</w:t>
-      </w:r>
-      <w:proofErr w:type="spellEnd"/>
-      <w:r>
-        <w:t>\</w:t>
-      </w:r>
-      <w:proofErr w:type="spellStart"/>
-      <w:r>
-        <w:t>dataset_output</w:t>
-      </w:r>
-      <w:proofErr w:type="spellEnd"/>
-      <w:r>
-        <w:t>) of which to perform the analysis on, using the scripts listed in the below section with checkboxes. The included analysis scripts all perform functionality described by their name, both prefix “Check_” scripts for missing data and outliers will only run in the console output window below</w:t>
-      </w:r>
-      <w:r>
-        <w:t xml:space="preserve"> (Use the “Run button as before to execute all selected scripts)</w:t>
-      </w:r>
-      <w:r>
-        <w:t>, while all of the “Plot_” prefix scripts will generate graph plots of the dataset using the “</w:t>
+        <w:t>“Plot_” prefix scripts will generate graph plots of the dataset using the “</w:t>
       </w:r>
       <w:proofErr w:type="spellStart"/>
       <w:r>
@@ -787,7 +1402,7 @@
       <w:r>
         <w:pict>
           <v:shape id="_x0000_i1029" type="#_x0000_t75" style="width:451pt;height:444.1pt">
-            <v:imagedata r:id="rId9" o:title="Example_Plolt_Analyse"/>
+            <v:imagedata r:id="rId10" o:title="Example_Plolt_Analyse"/>
           </v:shape>
         </w:pict>
       </w:r>
@@ -872,39 +1487,39 @@
     <w:p/>
     <w:p>
       <w:r>
+        <w:t>Once the user has understood and analysed the dataset, the next step (if required) is to close the Analyse Data Collection window, return again to the main window and navigate to the “Process Dataset” button, which of course opens its corresponding interface. This new window is identical except for the “Available Scripts” section states “Processing” instead of “Analysis” and will populate from the “</w:t>
+      </w:r>
+      <w:proofErr w:type="spellStart"/>
+      <w:r>
+        <w:t>Dataset_Processing_Methods</w:t>
+      </w:r>
+      <w:proofErr w:type="spellEnd"/>
+      <w:r>
+        <w:t>” folder instead of the analysis methods folder (</w:t>
+      </w:r>
+      <w:r>
+        <w:t>\</w:t>
+      </w:r>
+      <w:proofErr w:type="spellStart"/>
+      <w:r>
+        <w:t>Dataset_Modules</w:t>
+      </w:r>
+      <w:proofErr w:type="spellEnd"/>
+      <w:r>
+        <w:t>\</w:t>
+      </w:r>
+      <w:proofErr w:type="spellStart"/>
+      <w:r>
+        <w:t>Dataset_Processing_Methods</w:t>
+      </w:r>
+      <w:proofErr w:type="spellEnd"/>
+      <w:r>
+        <w:t>).</w:t>
+      </w:r>
+    </w:p>
+    <w:p>
+      <w:r>
         <w:lastRenderedPageBreak/>
-        <w:t>Once the user has understood and analysed the dataset, the next step (if required) is to close the Analyse Data Collection window, return again to the main window and navigate to the “Process Dataset” button, which of course opens its corresponding interface. This new window is identical except for the “Available Scripts” section states “Processing” instead of “Analysis” and will populate from the “</w:t>
-      </w:r>
-      <w:proofErr w:type="spellStart"/>
-      <w:r>
-        <w:t>Dataset_Processing_Methods</w:t>
-      </w:r>
-      <w:proofErr w:type="spellEnd"/>
-      <w:r>
-        <w:t>” folder instead of the analysis methods folder (</w:t>
-      </w:r>
-      <w:r>
-        <w:t>\</w:t>
-      </w:r>
-      <w:proofErr w:type="spellStart"/>
-      <w:r>
-        <w:t>Dataset_Modules</w:t>
-      </w:r>
-      <w:proofErr w:type="spellEnd"/>
-      <w:r>
-        <w:t>\</w:t>
-      </w:r>
-      <w:proofErr w:type="spellStart"/>
-      <w:r>
-        <w:t>Dataset_Processing_Methods</w:t>
-      </w:r>
-      <w:proofErr w:type="spellEnd"/>
-      <w:r>
-        <w:t>).</w:t>
-      </w:r>
-    </w:p>
-    <w:p>
-      <w:r>
         <w:t xml:space="preserve">There are four included Processing scripts, two for “de-noising” (described in more detail in the report, and code comments) with one for plotting the noise removed from the dataset as well as performing it on and saving the result as a new </w:t>
       </w:r>
       <w:r>
@@ -972,7 +1587,7 @@
       <w:r>
         <w:pict>
           <v:shape id="_x0000_i1030" type="#_x0000_t75" style="width:250pt;height:284.55pt">
-            <v:imagedata r:id="rId10" o:title="feature_selection_window"/>
+            <v:imagedata r:id="rId11" o:title="feature_selection_window"/>
           </v:shape>
         </w:pict>
       </w:r>
@@ -1039,7 +1654,6 @@
     <w:p/>
     <w:p>
       <w:r>
-        <w:lastRenderedPageBreak/>
         <w:t>Once any combination of feature selection scripts have been selected and run using the “Run” button, a plot graph will be generated to</w:t>
       </w:r>
       <w:r>
@@ -1051,9 +1665,10 @@
         <w:keepNext/>
       </w:pPr>
       <w:r>
+        <w:lastRenderedPageBreak/>
         <w:pict>
           <v:shape id="_x0000_i1031" type="#_x0000_t75" style="width:397.45pt;height:222.35pt">
-            <v:imagedata r:id="rId11" o:title="feature_selection_plot_example"/>
+            <v:imagedata r:id="rId12" o:title="feature_selection_plot_example"/>
           </v:shape>
         </w:pict>
       </w:r>
@@ -1209,7 +1824,7 @@
       <w:r>
         <w:pict>
           <v:shape id="_x0000_i1032" type="#_x0000_t75" style="width:368.65pt;height:104.85pt">
-            <v:imagedata r:id="rId12" o:title="xLSTM_TS_chart_modules_with_legend"/>
+            <v:imagedata r:id="rId13" o:title="xLSTM_TS_chart_modules_with_legend"/>
           </v:shape>
         </w:pict>
       </w:r>
@@ -1292,7 +1907,6 @@
     <w:p/>
     <w:p>
       <w:r>
-        <w:lastRenderedPageBreak/>
         <w:t>The node type and colour ma</w:t>
       </w:r>
       <w:r>
@@ -1307,9 +1921,10 @@
         <w:keepNext/>
       </w:pPr>
       <w:r>
+        <w:lastRenderedPageBreak/>
         <w:pict>
           <v:shape id="_x0000_i1033" type="#_x0000_t75" style="width:304.7pt;height:334.1pt">
-            <v:imagedata r:id="rId13" o:title="AI_Model_Map_Code_Example"/>
+            <v:imagedata r:id="rId14" o:title="AI_Model_Map_Code_Example"/>
           </v:shape>
         </w:pict>
       </w:r>
@@ -1418,7 +2033,6 @@
     <w:p/>
     <w:p>
       <w:r>
-        <w:lastRenderedPageBreak/>
         <w:t xml:space="preserve">Below is an example of both the MEMD-TCN Model Training Configuration window and the </w:t>
       </w:r>
       <w:proofErr w:type="spellStart"/>
@@ -1435,9 +2049,10 @@
         <w:keepNext/>
       </w:pPr>
       <w:r>
+        <w:lastRenderedPageBreak/>
         <w:pict>
           <v:shape id="_x0000_i1034" type="#_x0000_t75" style="width:236.15pt;height:289.75pt">
-            <v:imagedata r:id="rId14" o:title="AI_Model_Training_MEMD"/>
+            <v:imagedata r:id="rId15" o:title="AI_Model_Training_MEMD"/>
           </v:shape>
         </w:pict>
       </w:r>
@@ -1508,7 +2123,7 @@
       <w:r>
         <w:pict>
           <v:shape id="_x0000_i1035" type="#_x0000_t75" style="width:236.15pt;height:266.7pt">
-            <v:imagedata r:id="rId15" o:title="AI_Model_Training_xLSTM"/>
+            <v:imagedata r:id="rId16" o:title="AI_Model_Training_xLSTM"/>
           </v:shape>
         </w:pict>
       </w:r>
@@ -1607,8 +2222,11 @@
     <w:p/>
     <w:p>
       <w:r>
+        <w:t xml:space="preserve">Looking at both of these windows, the “Dataset” section is the same across both of them. The first drop down is for selecting the dataset that the model will be trained with, it is important to note that the dataset selected for the model will mean result in the saved model will expect the same </w:t>
+      </w:r>
+      <w:r>
         <w:lastRenderedPageBreak/>
-        <w:t>Looking at both of these windows, the “Dataset” section is the same across both of them. The first drop down is for selecting the dataset that the model will be trained with, it is important to note that the dataset selected for the model will mean result in the saved model will expect the same number of feature dimensions when used for evaluation in subsequent steps. So it may be important to not which dataset was specifically used for training.</w:t>
+        <w:t>number of feature dimensions when used for evaluation in subsequent steps. So it may be important to not which dataset was specifically used for training.</w:t>
       </w:r>
     </w:p>
     <w:p>
@@ -1717,7 +2335,7 @@
       <w:r>
         <w:pict>
           <v:shape id="_x0000_i1036" type="#_x0000_t75" style="width:303.55pt;height:237.3pt">
-            <v:imagedata r:id="rId16" o:title="AI_Model_Evaluation_Window"/>
+            <v:imagedata r:id="rId17" o:title="AI_Model_Evaluation_Window"/>
           </v:shape>
         </w:pict>
       </w:r>
@@ -1788,8 +2406,11 @@
     </w:p>
     <w:p>
       <w:r>
+        <w:t xml:space="preserve">The “Available Scripts” section functions as the previous windows where selecting scripts with the checkboxes will execute them once the “Run” button is pressed, in this case within the previous </w:t>
+      </w:r>
+      <w:r>
         <w:lastRenderedPageBreak/>
-        <w:t>The “Available Scripts” section functions as the previous windows where selecting scripts with the checkboxes will execute them once the “Run” button is pressed, in this case within the previous main Model Designer window after all the settings have been set and the “OK” button has been pressed.</w:t>
+        <w:t>main Model Designer window after all the settings have been set and the “OK” button has been pressed.</w:t>
       </w:r>
       <w:r>
         <w:t xml:space="preserve"> Each script has been named accordingly with only “eval_classification_metrics.py” and “eval_regression_metrics.py” which evaluate combinations at a time and categorised as such, with the first evaluating for “Accuracy”, “Precision”, “Recall” and “F1 Score” and the later “Means Absolute Error (M</w:t>
@@ -1894,7 +2515,7 @@
       <w:r>
         <w:pict>
           <v:shape id="_x0000_i1037" type="#_x0000_t75" style="width:425.1pt;height:245.4pt">
-            <v:imagedata r:id="rId17" o:title="predictions_vs_actuals_Example"/>
+            <v:imagedata r:id="rId18" o:title="predictions_vs_actuals_Example"/>
           </v:shape>
         </w:pict>
       </w:r>
@@ -1961,30 +2582,169 @@
     <w:p/>
     <w:p/>
     <w:p/>
+    <w:p>
+      <w:pPr>
+        <w:pStyle w:val="Heading1"/>
+        <w:rPr>
+          <w:color w:val="auto"/>
+        </w:rPr>
+      </w:pPr>
+      <w:r>
+        <w:rPr>
+          <w:color w:val="auto"/>
+        </w:rPr>
+        <w:lastRenderedPageBreak/>
+        <w:t xml:space="preserve">Adding new custom </w:t>
+      </w:r>
+      <w:r>
+        <w:rPr>
+          <w:color w:val="auto"/>
+        </w:rPr>
+        <w:t>Script</w:t>
+      </w:r>
+      <w:r>
+        <w:rPr>
+          <w:color w:val="auto"/>
+        </w:rPr>
+        <w:t>s</w:t>
+      </w:r>
+    </w:p>
     <w:p/>
     <w:p>
       <w:r>
-        <w:t>Scripting:</w:t>
-      </w:r>
-    </w:p>
-    <w:p/>
-    <w:p>
-      <w:r>
-        <w:t>Adding scripts for Dataset Collection</w:t>
-      </w:r>
-    </w:p>
-    <w:p>
-      <w:r>
-        <w:t xml:space="preserve">When creating a </w:t>
-      </w:r>
-      <w:r>
-        <w:t xml:space="preserve">new </w:t>
-      </w:r>
-      <w:r>
-        <w:t>single column / feature dataset python script</w:t>
-      </w:r>
-      <w:r>
-        <w:t>, the structure to follow is quite simple. First a new “.</w:t>
+        <w:t xml:space="preserve">When creating </w:t>
+      </w:r>
+      <w:r>
+        <w:t xml:space="preserve">new custom scripts to be ran inside the GUI the same as the existing ones, the user must first navigate to the folder location where the </w:t>
+      </w:r>
+      <w:r>
+        <w:t xml:space="preserve">pre-existing </w:t>
+      </w:r>
+      <w:r>
+        <w:t xml:space="preserve">scripts are found. For each pipeline section in the repository there </w:t>
+      </w:r>
+      <w:r>
+        <w:t>is a</w:t>
+      </w:r>
+      <w:r>
+        <w:t xml:space="preserve"> </w:t>
+      </w:r>
+      <w:r>
+        <w:t>corresponding</w:t>
+      </w:r>
+      <w:r>
+        <w:t xml:space="preserve"> </w:t>
+      </w:r>
+      <w:r>
+        <w:t>folder structure</w:t>
+      </w:r>
+      <w:r>
+        <w:t xml:space="preserve"> for each</w:t>
+      </w:r>
+      <w:r>
+        <w:t xml:space="preserve"> section inside their “Modules” parent folder</w:t>
+      </w:r>
+      <w:r>
+        <w:t>, “</w:t>
+      </w:r>
+      <w:proofErr w:type="spellStart"/>
+      <w:r>
+        <w:t>Dataset_Collection</w:t>
+      </w:r>
+      <w:proofErr w:type="spellEnd"/>
+      <w:r>
+        <w:t xml:space="preserve">” </w:t>
+      </w:r>
+      <w:r>
+        <w:t>and “</w:t>
+      </w:r>
+      <w:proofErr w:type="spellStart"/>
+      <w:r>
+        <w:t>Dataset_</w:t>
+      </w:r>
+      <w:r>
+        <w:t>Processing</w:t>
+      </w:r>
+      <w:r>
+        <w:t>_Methods</w:t>
+      </w:r>
+      <w:proofErr w:type="spellEnd"/>
+      <w:r>
+        <w:t>” are under “</w:t>
+      </w:r>
+      <w:proofErr w:type="spellStart"/>
+      <w:r>
+        <w:t>Dataset_Modules</w:t>
+      </w:r>
+      <w:proofErr w:type="spellEnd"/>
+      <w:r>
+        <w:t>”, “</w:t>
+      </w:r>
+      <w:proofErr w:type="spellStart"/>
+      <w:r>
+        <w:t>Model_Designs</w:t>
+      </w:r>
+      <w:proofErr w:type="spellEnd"/>
+      <w:r>
+        <w:t>” and “</w:t>
+      </w:r>
+      <w:proofErr w:type="spellStart"/>
+      <w:r>
+        <w:t>Training_Methods</w:t>
+      </w:r>
+      <w:proofErr w:type="spellEnd"/>
+      <w:r>
+        <w:t>” under “</w:t>
+      </w:r>
+      <w:proofErr w:type="spellStart"/>
+      <w:r>
+        <w:t>AI_Modules</w:t>
+      </w:r>
+      <w:proofErr w:type="spellEnd"/>
+      <w:r>
+        <w:t>” etc.</w:t>
+      </w:r>
+    </w:p>
+    <w:p>
+      <w:r>
+        <w:t>Each GUI menu for the selection of the scripts are populated from those folders, in order for those scripts inside of them to be executed with the GUI inputs (depending on the use case, they may not require them) they will need to use the python library “</w:t>
+      </w:r>
+      <w:proofErr w:type="spellStart"/>
+      <w:r>
+        <w:t>argarse</w:t>
+      </w:r>
+      <w:proofErr w:type="spellEnd"/>
+      <w:r>
+        <w:t>”.</w:t>
+      </w:r>
+      <w:r>
+        <w:t xml:space="preserve"> </w:t>
+      </w:r>
+    </w:p>
+    <w:p>
+      <w:r>
+        <w:t xml:space="preserve">For an example of how </w:t>
+      </w:r>
+      <w:r>
+        <w:t>this works</w:t>
+      </w:r>
+      <w:r>
+        <w:t xml:space="preserve"> </w:t>
+      </w:r>
+      <w:r>
+        <w:t>when creating a</w:t>
+      </w:r>
+      <w:r>
+        <w:t xml:space="preserve"> new </w:t>
+      </w:r>
+      <w:r>
+        <w:t xml:space="preserve">data collection script, the user </w:t>
+      </w:r>
+      <w:r>
+        <w:t xml:space="preserve">must </w:t>
+      </w:r>
+      <w:r>
+        <w:t>create a new “.</w:t>
       </w:r>
       <w:proofErr w:type="spellStart"/>
       <w:r>
@@ -1992,7 +2752,10 @@
       </w:r>
       <w:proofErr w:type="spellEnd"/>
       <w:r>
-        <w:t>” file must be created in the “/</w:t>
+        <w:t>” file in the folder location of</w:t>
+      </w:r>
+      <w:r>
+        <w:t xml:space="preserve"> “/</w:t>
       </w:r>
       <w:proofErr w:type="spellStart"/>
       <w:r>
@@ -2008,29 +2771,24 @@
       </w:r>
       <w:proofErr w:type="spellEnd"/>
       <w:r>
-        <w:t xml:space="preserve">” folder, inside this new file (preferably edited within an IDE such as </w:t>
-      </w:r>
-      <w:proofErr w:type="spellStart"/>
-      <w:r>
-        <w:t>VScode</w:t>
-      </w:r>
-      <w:proofErr w:type="spellEnd"/>
-      <w:r>
-        <w:t xml:space="preserve">) the user will need to produce python code for collecting data from a source API (such as </w:t>
-      </w:r>
-      <w:proofErr w:type="spellStart"/>
-      <w:r>
-        <w:t>yfiannce</w:t>
-      </w:r>
-      <w:proofErr w:type="spellEnd"/>
-      <w:r>
-        <w:t xml:space="preserve"> for an example) in the same way as they would normally from scratch. However the inputs for what data to collect must be setup as inputs from the interface scripts, which </w:t>
-      </w:r>
-      <w:r>
-        <w:t>are</w:t>
-      </w:r>
-      <w:r>
-        <w:t xml:space="preserve"> done using the “</w:t>
+        <w:t xml:space="preserve">” </w:t>
+      </w:r>
+      <w:r>
+        <w:t xml:space="preserve">in the repository root. Followed by any python code for data collection (in this case, </w:t>
+      </w:r>
+      <w:proofErr w:type="spellStart"/>
+      <w:r>
+        <w:t>yfinance</w:t>
+      </w:r>
+      <w:proofErr w:type="spellEnd"/>
+      <w:r>
+        <w:t>) that would expect to be executed normally from a standalone file or terminal</w:t>
+      </w:r>
+      <w:r>
+        <w:t xml:space="preserve">. </w:t>
+      </w:r>
+      <w:r>
+        <w:t>However the inputs that are related to the GUI elements will need to be inherited from the rest of the software, which is handled by the aforementioned “</w:t>
       </w:r>
       <w:proofErr w:type="spellStart"/>
       <w:r>
@@ -2038,12 +2796,26 @@
       </w:r>
       <w:proofErr w:type="spellEnd"/>
       <w:r>
-        <w:t>” python library.</w:t>
-      </w:r>
-    </w:p>
-    <w:p>
-      <w:r>
-        <w:t>It may be beneficial for the user to copy and paste the contents of one of the other existing data collection scripts as a template, to help understand how this is designed. Below are some of the contents of “currency_btc_price.py” to demonstrate.</w:t>
+        <w:t xml:space="preserve">”. </w:t>
+      </w:r>
+    </w:p>
+    <w:p>
+      <w:r>
+        <w:t xml:space="preserve">Inputs such as date range and chart frequency, </w:t>
+      </w:r>
+      <w:proofErr w:type="gramStart"/>
+      <w:r>
+        <w:t>It</w:t>
+      </w:r>
+      <w:proofErr w:type="gramEnd"/>
+      <w:r>
+        <w:t xml:space="preserve"> may be beneficial for the user to copy and paste the contents of one of the other existing data collection scripts as a template, to help understand how this is designed</w:t>
+      </w:r>
+      <w:r>
+        <w:t>, as there are ample comments within the code to help elaborate further</w:t>
+      </w:r>
+      <w:r>
+        <w:t>. Below are some of the contents of “currency_btc_price.py” to demonstrate.</w:t>
       </w:r>
     </w:p>
     <w:p>
@@ -2053,7 +2825,7 @@
       <w:r>
         <w:pict>
           <v:shape id="_x0000_i1038" type="#_x0000_t75" style="width:391.7pt;height:260.35pt">
-            <v:imagedata r:id="rId18" o:title="scripting_example_data_collection_1"/>
+            <v:imagedata r:id="rId19" o:title="scripting_example_data_collection_1"/>
           </v:shape>
         </w:pict>
       </w:r>
@@ -2119,10 +2891,34 @@
     </w:p>
     <w:p>
       <w:r>
-        <w:t xml:space="preserve">The “dataset_utils.py” </w:t>
-      </w:r>
-      <w:r>
-        <w:t>sets the default start, end and frequency inputs and as well as handling “</w:t>
+        <w:t>As part of the modular design</w:t>
+      </w:r>
+      <w:r>
+        <w:t xml:space="preserve"> the application relies on inheriting from </w:t>
+      </w:r>
+      <w:r>
+        <w:t xml:space="preserve">shared files in some locations, these are delineated with the suffix “_utils.py” found in the same location as the scripts (and will be </w:t>
+      </w:r>
+      <w:r>
+        <w:lastRenderedPageBreak/>
+        <w:t>found in their imports sections at the top of the scripts that use them). In this example for data collection the</w:t>
+      </w:r>
+      <w:r>
+        <w:t xml:space="preserve"> “dataset_utils.py” </w:t>
+      </w:r>
+      <w:r>
+        <w:t>handles many of the previously mentioned “</w:t>
+      </w:r>
+      <w:proofErr w:type="spellStart"/>
+      <w:r>
+        <w:t>argarse</w:t>
+      </w:r>
+      <w:proofErr w:type="spellEnd"/>
+      <w:r>
+        <w:t>” library calls for parameter inputs for handling</w:t>
+      </w:r>
+      <w:r>
+        <w:t xml:space="preserve"> “</w:t>
       </w:r>
       <w:proofErr w:type="spellStart"/>
       <w:r>
@@ -2130,22 +2926,23 @@
       </w:r>
       <w:proofErr w:type="spellEnd"/>
       <w:r>
-        <w:t xml:space="preserve">” (data frame) formatting, and returns </w:t>
-      </w:r>
-    </w:p>
-    <w:p/>
-    <w:p/>
-    <w:p/>
-    <w:p/>
+        <w:t>” (data frame) formatting, and returns</w:t>
+      </w:r>
+      <w:r>
+        <w:t xml:space="preserve"> allowing the first code example (figure 14.) to function and populate the data.</w:t>
+      </w:r>
+      <w:r>
+        <w:t xml:space="preserve"> </w:t>
+      </w:r>
+    </w:p>
     <w:p>
       <w:pPr>
         <w:keepNext/>
       </w:pPr>
       <w:r>
-        <w:lastRenderedPageBreak/>
         <w:pict>
           <v:shape id="_x0000_i1039" type="#_x0000_t75" style="width:408.4pt;height:305.3pt">
-            <v:imagedata r:id="rId19" o:title="scripting_example_data_collection"/>
+            <v:imagedata r:id="rId20" o:title="scripting_example_data_collection"/>
           </v:shape>
         </w:pict>
       </w:r>
@@ -2210,25 +3007,17 @@
       </w:r>
     </w:p>
     <w:p/>
-    <w:p/>
-    <w:p/>
-    <w:p/>
-    <w:p>
-      <w:r>
-        <w:t>Adding Scripts for Dataset Processing</w:t>
-      </w:r>
-    </w:p>
-    <w:p>
-      <w:r>
-        <w:t xml:space="preserve">Just handle panda’s / data frames </w:t>
-      </w:r>
-      <w:proofErr w:type="gramStart"/>
-      <w:r>
-        <w:t>good</w:t>
-      </w:r>
-      <w:proofErr w:type="gramEnd"/>
-      <w:r>
-        <w:t xml:space="preserve">, with </w:t>
+    <w:p>
+      <w:r>
+        <w:t>The rest of the software’s functionality works in the same way, all the interface interactions between the scripts and the GUI is handled through “</w:t>
+      </w:r>
+      <w:proofErr w:type="spellStart"/>
+      <w:r>
+        <w:t>argarse</w:t>
+      </w:r>
+      <w:proofErr w:type="spellEnd"/>
+      <w:r>
+        <w:t>” with the exception of the “</w:t>
       </w:r>
       <w:proofErr w:type="spellStart"/>
       <w:r>
@@ -2236,38 +3025,26 @@
       </w:r>
       <w:proofErr w:type="spellEnd"/>
       <w:r>
-        <w:t xml:space="preserve"> when using graphs.</w:t>
-      </w:r>
-    </w:p>
-    <w:p>
-      <w:r>
-        <w:t>Adding Scripts for additional AI Model Designs</w:t>
-      </w:r>
-    </w:p>
-    <w:p>
-      <w:r>
-        <w:t xml:space="preserve">Make sure to use </w:t>
-      </w:r>
-      <w:proofErr w:type="spellStart"/>
-      <w:r>
-        <w:t>arg.parse</w:t>
-      </w:r>
-      <w:proofErr w:type="spellEnd"/>
-      <w:r>
-        <w:t>, include a train.py for it.</w:t>
-      </w:r>
-      <w:bookmarkStart w:id="0" w:name="_GoBack"/>
-      <w:bookmarkEnd w:id="0"/>
-    </w:p>
-    <w:p>
-      <w:r>
-        <w:t>Adding Scripts for additional Model Evaluations</w:t>
-      </w:r>
-    </w:p>
-    <w:p/>
-    <w:p/>
-    <w:p/>
-    <w:p/>
+        <w:t xml:space="preserve">” library. </w:t>
+      </w:r>
+      <w:r>
+        <w:t>“</w:t>
+      </w:r>
+      <w:proofErr w:type="spellStart"/>
+      <w:r>
+        <w:t>Seaborn</w:t>
+      </w:r>
+      <w:proofErr w:type="spellEnd"/>
+      <w:r>
+        <w:t xml:space="preserve">” is used for the display and saving of the plot graphs, although there is nothing unique about how it is used and implemented within this program as it and the rest of the software’s python code is executed within the python environment, with the terminal output exposed within the GUI elements for logging and troubleshooting and can be </w:t>
+      </w:r>
+      <w:r>
+        <w:t>constructed</w:t>
+      </w:r>
+      <w:r>
+        <w:t xml:space="preserve"> as one would expect with the pre-requisite python experience.</w:t>
+      </w:r>
+    </w:p>
     <w:sectPr>
       <w:pgSz w:w="11906" w:h="16838"/>
       <w:pgMar w:top="1440" w:right="1440" w:bottom="1440" w:left="1440" w:header="708" w:footer="708" w:gutter="0"/>
@@ -2591,6 +3368,57 @@
       <w:szCs w:val="26"/>
     </w:rPr>
   </w:style>
+  <w:style w:type="paragraph" w:styleId="TOCHeading">
+    <w:name w:val="TOC Heading"/>
+    <w:basedOn w:val="Heading1"/>
+    <w:next w:val="Normal"/>
+    <w:uiPriority w:val="39"/>
+    <w:unhideWhenUsed/>
+    <w:qFormat/>
+    <w:rsid w:val="00F629ED"/>
+    <w:pPr>
+      <w:outlineLvl w:val="9"/>
+    </w:pPr>
+    <w:rPr>
+      <w:lang w:val="en-US" w:eastAsia="ja-JP"/>
+    </w:rPr>
+  </w:style>
+  <w:style w:type="paragraph" w:styleId="TOC1">
+    <w:name w:val="toc 1"/>
+    <w:basedOn w:val="Normal"/>
+    <w:next w:val="Normal"/>
+    <w:autoRedefine/>
+    <w:uiPriority w:val="39"/>
+    <w:unhideWhenUsed/>
+    <w:rsid w:val="00F629ED"/>
+    <w:pPr>
+      <w:spacing w:after="100"/>
+    </w:pPr>
+  </w:style>
+  <w:style w:type="paragraph" w:styleId="TOC2">
+    <w:name w:val="toc 2"/>
+    <w:basedOn w:val="Normal"/>
+    <w:next w:val="Normal"/>
+    <w:autoRedefine/>
+    <w:uiPriority w:val="39"/>
+    <w:unhideWhenUsed/>
+    <w:rsid w:val="00F629ED"/>
+    <w:pPr>
+      <w:spacing w:after="100"/>
+      <w:ind w:left="220"/>
+    </w:pPr>
+  </w:style>
+  <w:style w:type="character" w:styleId="Hyperlink">
+    <w:name w:val="Hyperlink"/>
+    <w:basedOn w:val="DefaultParagraphFont"/>
+    <w:uiPriority w:val="99"/>
+    <w:unhideWhenUsed/>
+    <w:rsid w:val="00F629ED"/>
+    <w:rPr>
+      <w:color w:val="0000FF" w:themeColor="hyperlink"/>
+      <w:u w:val="single"/>
+    </w:rPr>
+  </w:style>
 </w:styles>
 </file>
 
@@ -2907,6 +3735,57 @@
       <w:szCs w:val="26"/>
     </w:rPr>
   </w:style>
+  <w:style w:type="paragraph" w:styleId="TOCHeading">
+    <w:name w:val="TOC Heading"/>
+    <w:basedOn w:val="Heading1"/>
+    <w:next w:val="Normal"/>
+    <w:uiPriority w:val="39"/>
+    <w:unhideWhenUsed/>
+    <w:qFormat/>
+    <w:rsid w:val="00F629ED"/>
+    <w:pPr>
+      <w:outlineLvl w:val="9"/>
+    </w:pPr>
+    <w:rPr>
+      <w:lang w:val="en-US" w:eastAsia="ja-JP"/>
+    </w:rPr>
+  </w:style>
+  <w:style w:type="paragraph" w:styleId="TOC1">
+    <w:name w:val="toc 1"/>
+    <w:basedOn w:val="Normal"/>
+    <w:next w:val="Normal"/>
+    <w:autoRedefine/>
+    <w:uiPriority w:val="39"/>
+    <w:unhideWhenUsed/>
+    <w:rsid w:val="00F629ED"/>
+    <w:pPr>
+      <w:spacing w:after="100"/>
+    </w:pPr>
+  </w:style>
+  <w:style w:type="paragraph" w:styleId="TOC2">
+    <w:name w:val="toc 2"/>
+    <w:basedOn w:val="Normal"/>
+    <w:next w:val="Normal"/>
+    <w:autoRedefine/>
+    <w:uiPriority w:val="39"/>
+    <w:unhideWhenUsed/>
+    <w:rsid w:val="00F629ED"/>
+    <w:pPr>
+      <w:spacing w:after="100"/>
+      <w:ind w:left="220"/>
+    </w:pPr>
+  </w:style>
+  <w:style w:type="character" w:styleId="Hyperlink">
+    <w:name w:val="Hyperlink"/>
+    <w:basedOn w:val="DefaultParagraphFont"/>
+    <w:uiPriority w:val="99"/>
+    <w:unhideWhenUsed/>
+    <w:rsid w:val="00F629ED"/>
+    <w:rPr>
+      <w:color w:val="0000FF" w:themeColor="hyperlink"/>
+      <w:u w:val="single"/>
+    </w:rPr>
+  </w:style>
 </w:styles>
 </file>
 
@@ -3193,4 +4072,16 @@
   <a:objectDefaults/>
   <a:extraClrSchemeLst/>
 </a:theme>
+</file>
+
+<file path=customXml/item1.xml><?xml version="1.0" encoding="utf-8"?>
+<b:Sources xmlns:b="http://schemas.openxmlformats.org/officeDocument/2006/bibliography" xmlns="http://schemas.openxmlformats.org/officeDocument/2006/bibliography" SelectedStyle="\APASeventhEdition.xsl" StyleName="APA"/>
+</file>
+
+<file path=customXml/itemProps1.xml><?xml version="1.0" encoding="utf-8"?>
+<ds:datastoreItem xmlns:ds="http://schemas.openxmlformats.org/officeDocument/2006/customXml" ds:itemID="{9E85C78D-F964-4F14-B7F8-3FBB1345EEC7}">
+  <ds:schemaRefs>
+    <ds:schemaRef ds:uri="http://schemas.openxmlformats.org/officeDocument/2006/bibliography"/>
+  </ds:schemaRefs>
+</ds:datastoreItem>
 </file>
</xml_diff>